<commit_message>
Taller 1: capturas y documento con la versión en la nube
</commit_message>
<xml_diff>
--- a/Taller1_Corte2_Documentacion.docx
+++ b/Taller1_Corte2_Documentacion.docx
@@ -341,7 +341,7 @@
           </w:tcPr>
           <w:p>
             <w:r>
-              <w:t>Local: funcionando. Nube: preparado (adapter-static, variables VITE_API_URL), falta publicarlo</w:t>
+              <w:t>Cumplido: local y en Render (frontend estático + 2 APIs)</w:t>
             </w:r>
           </w:p>
         </w:tc>
@@ -2136,6 +2136,38 @@
         <w:pStyle w:val="ListBullet"/>
       </w:pPr>
       <w:r>
+        <w:t>Frontend: https://prestamos-frontend-svelte.onrender.com</w:t>
+      </w:r>
+    </w:p>
+    <w:p>
+      <w:pPr>
+        <w:pStyle w:val="ListBullet"/>
+      </w:pPr>
+      <w:r>
+        <w:t>API FastAPI: https://api-prestamos-fastapi.onrender.com/docs</w:t>
+      </w:r>
+    </w:p>
+    <w:p>
+      <w:pPr>
+        <w:pStyle w:val="ListBullet"/>
+      </w:pPr>
+      <w:r>
+        <w:t>API Express: https://api-prestamos-express.onrender.com/api/puntos-entrega/</w:t>
+      </w:r>
+    </w:p>
+    <w:p>
+      <w:pPr>
+        <w:pStyle w:val="ListBullet"/>
+      </w:pPr>
+      <w:r>
+        <w:t>Repositorio: https://github.com/Pomboea/prestamos-estudiantes</w:t>
+      </w:r>
+    </w:p>
+    <w:p>
+      <w:pPr>
+        <w:pStyle w:val="ListBullet"/>
+      </w:pPr>
+      <w:r>
         <w:t>APIs: render.yaml y docs/DESPLIEGUE.md (servicios FastAPI y Express, misma SECRET_KEY).</w:t>
       </w:r>
     </w:p>
@@ -2152,7 +2184,157 @@
         <w:pStyle w:val="ListBullet"/>
       </w:pPr>
       <w:r>
-        <w:t>Después de desplegar, cargar schema.sql y seed.sql en las bases de la nube.</w:t>
+        <w:t>Las APIs recrean el esquema con la semilla nueva al arrancar si detectan la anterior (o con FORZAR_SEMILLA=true); también herramientas/recargar_remoto.py.</w:t>
+      </w:r>
+    </w:p>
+    <w:p>
+      <w:pPr>
+        <w:jc w:val="center"/>
+      </w:pPr>
+      <w:r>
+        <w:drawing>
+          <wp:inline xmlns:a="http://schemas.openxmlformats.org/drawingml/2006/main" xmlns:pic="http://schemas.openxmlformats.org/drawingml/2006/picture">
+            <wp:extent cx="5760720" cy="4390124"/>
+            <wp:docPr id="30" name="Picture 30"/>
+            <wp:cNvGraphicFramePr>
+              <a:graphicFrameLocks noChangeAspect="1"/>
+            </wp:cNvGraphicFramePr>
+            <a:graphic>
+              <a:graphicData uri="http://schemas.openxmlformats.org/drawingml/2006/picture">
+                <pic:pic>
+                  <pic:nvPicPr>
+                    <pic:cNvPr id="0" name="12_inicio_admin_21_modulos.png"/>
+                    <pic:cNvPicPr/>
+                  </pic:nvPicPr>
+                  <pic:blipFill>
+                    <a:blip r:embed="rId20"/>
+                    <a:stretch>
+                      <a:fillRect/>
+                    </a:stretch>
+                  </pic:blipFill>
+                  <pic:spPr>
+                    <a:xfrm>
+                      <a:off x="0" y="0"/>
+                      <a:ext cx="5760720" cy="4390124"/>
+                    </a:xfrm>
+                    <a:prstGeom prst="rect"/>
+                  </pic:spPr>
+                </pic:pic>
+              </a:graphicData>
+            </a:graphic>
+          </wp:inline>
+        </w:drawing>
+      </w:r>
+    </w:p>
+    <w:p>
+      <w:pPr>
+        <w:jc w:val="center"/>
+      </w:pPr>
+      <w:r>
+        <w:rPr>
+          <w:i/>
+        </w:rPr>
+        <w:t>Captura 48: nube: inicio admin</w:t>
+      </w:r>
+    </w:p>
+    <w:p>
+      <w:pPr>
+        <w:jc w:val="center"/>
+      </w:pPr>
+      <w:r>
+        <w:drawing>
+          <wp:inline xmlns:a="http://schemas.openxmlformats.org/drawingml/2006/main" xmlns:pic="http://schemas.openxmlformats.org/drawingml/2006/picture">
+            <wp:extent cx="5760720" cy="3795496"/>
+            <wp:docPr id="31" name="Picture 31"/>
+            <wp:cNvGraphicFramePr>
+              <a:graphicFrameLocks noChangeAspect="1"/>
+            </wp:cNvGraphicFramePr>
+            <a:graphic>
+              <a:graphicData uri="http://schemas.openxmlformats.org/drawingml/2006/picture">
+                <pic:pic>
+                  <pic:nvPicPr>
+                    <pic:cNvPr id="0" name="49_nube_coordinador_puntos_entrega.png"/>
+                    <pic:cNvPicPr/>
+                  </pic:nvPicPr>
+                  <pic:blipFill>
+                    <a:blip r:embed="rId38"/>
+                    <a:stretch>
+                      <a:fillRect/>
+                    </a:stretch>
+                  </pic:blipFill>
+                  <pic:spPr>
+                    <a:xfrm>
+                      <a:off x="0" y="0"/>
+                      <a:ext cx="5760720" cy="3795496"/>
+                    </a:xfrm>
+                    <a:prstGeom prst="rect"/>
+                  </pic:spPr>
+                </pic:pic>
+              </a:graphicData>
+            </a:graphic>
+          </wp:inline>
+        </w:drawing>
+      </w:r>
+    </w:p>
+    <w:p>
+      <w:pPr>
+        <w:jc w:val="center"/>
+      </w:pPr>
+      <w:r>
+        <w:rPr>
+          <w:i/>
+        </w:rPr>
+        <w:t>Captura 49: nube: módulo Express</w:t>
+      </w:r>
+    </w:p>
+    <w:p>
+      <w:pPr>
+        <w:jc w:val="center"/>
+      </w:pPr>
+      <w:r>
+        <w:drawing>
+          <wp:inline xmlns:a="http://schemas.openxmlformats.org/drawingml/2006/main" xmlns:pic="http://schemas.openxmlformats.org/drawingml/2006/picture">
+            <wp:extent cx="5760720" cy="3795496"/>
+            <wp:docPr id="32" name="Picture 32"/>
+            <wp:cNvGraphicFramePr>
+              <a:graphicFrameLocks noChangeAspect="1"/>
+            </wp:cNvGraphicFramePr>
+            <a:graphic>
+              <a:graphicData uri="http://schemas.openxmlformats.org/drawingml/2006/picture">
+                <pic:pic>
+                  <pic:nvPicPr>
+                    <pic:cNvPr id="0" name="50_nube_estudiante_solicitudes.png"/>
+                    <pic:cNvPicPr/>
+                  </pic:nvPicPr>
+                  <pic:blipFill>
+                    <a:blip r:embed="rId39"/>
+                    <a:stretch>
+                      <a:fillRect/>
+                    </a:stretch>
+                  </pic:blipFill>
+                  <pic:spPr>
+                    <a:xfrm>
+                      <a:off x="0" y="0"/>
+                      <a:ext cx="5760720" cy="3795496"/>
+                    </a:xfrm>
+                    <a:prstGeom prst="rect"/>
+                  </pic:spPr>
+                </pic:pic>
+              </a:graphicData>
+            </a:graphic>
+          </wp:inline>
+        </w:drawing>
+      </w:r>
+    </w:p>
+    <w:p>
+      <w:pPr>
+        <w:jc w:val="center"/>
+      </w:pPr>
+      <w:r>
+        <w:rPr>
+          <w:i/>
+        </w:rPr>
+        <w:t>Captura 50: nube: solicitudes del estudiante</w:t>
       </w:r>
     </w:p>
     <w:p>
@@ -2168,7 +2350,7 @@
         <w:pStyle w:val="ListBullet"/>
       </w:pPr>
       <w:r>
-        <w:t>Falta publicar la versión en la nube y colocar aquí sus URL.</w:t>
+        <w:t>En el plan gratuito de Render las APIs se duermen: la primera petición puede tardar ~1 minuto.</w:t>
       </w:r>
     </w:p>
     <w:p>

</xml_diff>

<commit_message>
Frontend presU con la estructura del docente: services autocontenidos (21), lib/index.js y assets, CRUD propio por página, sin +layout.js; iniciar-todo.bat
</commit_message>
<xml_diff>
--- a/Taller1_Corte2_Documentacion.docx
+++ b/Taller1_Corte2_Documentacion.docx
@@ -669,7 +669,7 @@
         <w:pStyle w:val="ListBullet"/>
       </w:pPr>
       <w:r>
-        <w:t>npx sv create frontend-svelte – plantilla minimal – JavaScript</w:t>
+        <w:t>npx sv create presU – plantilla minimal – JavaScript (carpeta presU; en package.json "name": "presu" porque npm exige minúsculas)</w:t>
       </w:r>
     </w:p>
     <w:p>
@@ -677,7 +677,7 @@
         <w:pStyle w:val="ListBullet"/>
       </w:pPr>
       <w:r>
-        <w:t>src/lib/components/: Navbar, Footer, Header, Card, Boton, Alerta, Cargando, Insignia, CampoFormulario, DataTable, CrudModulo</w:t>
+        <w:t>src/lib/: assets/, components/, services/ e index.js (sesión compartida), igual que la imagen del docente</w:t>
       </w:r>
     </w:p>
     <w:p>
@@ -685,7 +685,7 @@
         <w:pStyle w:val="ListBullet"/>
       </w:pPr>
       <w:r>
-        <w:t>src/lib/services/api_&lt;recurso&gt;.js con procesarRespuesta, obtenerX, obtenerXPorId, crearX, actualizarX, eliminarX</w:t>
+        <w:t>src/lib/components/ (10 reutilizables): Navbar, Footer, Header, Card, Boton, Alerta, Cargando, Insignia, CampoFormulario, DataTable</w:t>
       </w:r>
     </w:p>
     <w:p>
@@ -693,7 +693,23 @@
         <w:pStyle w:val="ListBullet"/>
       </w:pPr>
       <w:r>
-        <w:t>src/routes/+layout.svelte con Navbar, &lt;slot /&gt; y Footer; +page.svelte es el inicio; login/ y una carpeta por módulo</w:t>
+        <w:t>src/lib/services/: solo api_&lt;recurso&gt;.js, uno por tabla (21), cada uno con su URL_BASE, encabezados (JWT), procesarRespuesta, obtenerX, obtenerXPorId, crearX, actualizarX, eliminarX</w:t>
+      </w:r>
+    </w:p>
+    <w:p>
+      <w:pPr>
+        <w:pStyle w:val="ListBullet"/>
+      </w:pPr>
+      <w:r>
+        <w:t>src/routes/: +layout.svelte (Navbar, &lt;slot /&gt;, Footer), +page.svelte (inicio) y una carpeta por módulo (incluido login/) con solo +page.svelte; src/app.html</w:t>
+      </w:r>
+    </w:p>
+    <w:p>
+      <w:pPr>
+        <w:pStyle w:val="ListBullet"/>
+      </w:pPr>
+      <w:r>
+        <w:t>Cada +page.svelte trae su propio CRUD como el documento: onMount, cargarX, limpiarFormulario, guardarX, prepararEdicion, borrarX</w:t>
       </w:r>
     </w:p>
     <w:p>
@@ -719,7 +735,7 @@
       <w:r>
         <w:drawing>
           <wp:inline xmlns:a="http://schemas.openxmlformats.org/drawingml/2006/main" xmlns:pic="http://schemas.openxmlformats.org/drawingml/2006/picture">
-            <wp:extent cx="4572000" cy="5272088"/>
+            <wp:extent cx="4572000" cy="26974800"/>
             <wp:docPr id="3" name="Picture 3"/>
             <wp:cNvGraphicFramePr>
               <a:graphicFrameLocks noChangeAspect="1"/>
@@ -740,7 +756,7 @@
                   <pic:spPr>
                     <a:xfrm>
                       <a:off x="0" y="0"/>
-                      <a:ext cx="4572000" cy="5272088"/>
+                      <a:ext cx="4572000" cy="26974800"/>
                     </a:xfrm>
                     <a:prstGeom prst="rect"/>
                   </pic:spPr>
@@ -799,7 +815,15 @@
         <w:pStyle w:val="ListNumber"/>
       </w:pPr>
       <w:r>
-        <w:t>frontend-svelte: npm install, npm run dev y abrir http://localhost:5173</w:t>
+        <w:t>presU: npm install, npm run dev y abrir http://localhost:5173</w:t>
+      </w:r>
+    </w:p>
+    <w:p>
+      <w:pPr>
+        <w:pStyle w:val="ListNumber"/>
+      </w:pPr>
+      <w:r>
+        <w:t>Atajo en Windows (sin admin): doble clic en iniciar-todo.bat en la raíz. Inicia MySQL como proceso (C:\Users\POMBO\mysql-data, config C:\Users\POMBO\mysql-data-config\my.ini), abre ventanas para FastAPI (8000), Express (3000) y presU (5173; hace npm install si falta) y abre el navegador.</w:t>
       </w:r>
     </w:p>
     <w:p>

</xml_diff>